<commit_message>
Adenome S3 2026, CDH1 umformuliert
</commit_message>
<xml_diff>
--- a/Keimbahnmutationen_Arztbrief_Textbausteine.docx
+++ b/Keimbahnmutationen_Arztbrief_Textbausteine.docx
@@ -53,7 +53,7 @@
           <w:i w:val="0"/>
           <w:sz w:val="22"/>
         </w:rPr>
-        <w:t>Bei Nachweis von ≥10 Adenomen in der Koloskopie empfehlen wir eine humangenetische Beratung zum Ausschluss eines hereditären Polyposis-Syndroms (u.a. attenuierte FAP, MUTYH-assoziierte Polyposis). Dies gilt auch bei zufälligem Befund im Rahmen der Vorsorgekoloskopie.</w:t>
+        <w:t>Gemäß S3-Leitlinie Kolorektales Karzinom (Version 3.2, März 2026) empfehlen wir bei Nachweis von mehr als 10 Adenomen in der Koloskopie — unabhängig vom Alter und auch bei Zufallsbefund im Rahmen der Vorsorgekoloskopie — eine humangenetische Beratung zum Ausschluss eines hereditären Polyposis-Syndroms (insbesondere attenuierte FAP/APC-Mutation, MUTYH-assoziierte Polyposis).</w:t>
       </w:r>
     </w:p>
     <w:p>
@@ -93,7 +93,7 @@
           <w:i w:val="0"/>
           <w:sz w:val="22"/>
         </w:rPr>
-        <w:t>Bei dem Patienten / der Patientin wurde ein Magenkarzinom vom diffusen Typ (Siegelringzellkarzinom / lobuläres Wachstumsmuster) diagnostiziert. Bei Assoziation mit einer CDH1-Keimbahnmutation empfehlen wir eine ausführliche Familienanamnese hinsichtlich diffuser Magenkarzinome und lobulärer Mammakarzinome. Bei Erfüllung der IGCLC-Kriterien (u.a. ≥2 Fälle von diffusem Magenkarzinom in der Familie, Erstdiagnose vor dem 50. Lebensjahr, oder diffuses Magenkarzinom vor dem 35. Lebensjahr) empfehlen wir eine humangenetische Beratung und ggf. CDH1-Keimbahndiagnostik.</w:t>
+        <w:t>Bei dem Patienten / der Patientin wurde histologisch ein Magenkarzinom vom diffusen Typ (Siegelringzellkarzinom / lobuläres Wachstumsmuster) nachgewiesen. Wir empfehlen die Erhebung einer ausführlichen Familienanamnese hinsichtlich diffuser Magenkarzinome und lobulärer Mammakarzinome über mindestens drei Generationen. Bei Erfüllung der IGCLC-Kriterien — insbesondere bei ≥2 Fällen von diffusem Magenkarzinom in der Familie (davon mindestens einer vor dem 50. Lebensjahr), bei diffusem Magenkarzinom vor dem 35. Lebensjahr, oder bei Kombination mit lobulärem Mammakarzinom — empfehlen wir eine humangenetische Beratung und ggf. CDH1-Keimbahndiagnostik.</w:t>
       </w:r>
     </w:p>
     <w:p>

</xml_diff>

<commit_message>
Baustein 1/2/3 aus Überschriften entfernt
</commit_message>
<xml_diff>
--- a/Keimbahnmutationen_Arztbrief_Textbausteine.docx
+++ b/Keimbahnmutationen_Arztbrief_Textbausteine.docx
@@ -40,7 +40,7 @@
           <w:i w:val="0"/>
           <w:sz w:val="24"/>
         </w:rPr>
-        <w:t>Baustein 1 – Zufallsbefund ≥10 Adenome in der Koloskopie</w:t>
+        <w:t>Zufallsbefund ≥10 Adenome in der Koloskopie</w:t>
       </w:r>
     </w:p>
     <w:p>
@@ -80,7 +80,7 @@
           <w:i w:val="0"/>
           <w:sz w:val="24"/>
         </w:rPr>
-        <w:t>Baustein 2 – Diffuses Magenkarzinom (Verdacht HDGC / CDH1-Mutation)</w:t>
+        <w:t>Diffuses Magenkarzinom (Verdacht HDGC / CDH1-Mutation)</w:t>
       </w:r>
     </w:p>
     <w:p>
@@ -120,7 +120,7 @@
           <w:i w:val="0"/>
           <w:sz w:val="24"/>
         </w:rPr>
-        <w:t>Baustein 3 – Hereditäres Pankreaskarzinom (BRCA1/2 · PALB2 · ATM)</w:t>
+        <w:t>Hereditäres Pankreaskarzinom (BRCA1/2 · PALB2 · ATM)</w:t>
       </w:r>
     </w:p>
     <w:p>

</xml_diff>